<commit_message>
Refine heading numbering and default page numbering
</commit_message>
<xml_diff>
--- a/demo/offline/minutes-纪要/20260404-关于研究“刀盾”网络传播热度情况的专题会议纪要-v01.docx
+++ b/demo/offline/minutes-纪要/20260404-关于研究“刀盾”网络传播热度情况的专题会议纪要-v01.docx
@@ -1,6 +1,6 @@
 
 <file path=word/document.xml><?xml version="1.0" encoding="utf-8"?>
-<w:document xmlns:w="http://schemas.openxmlformats.org/wordprocessingml/2006/main" xmlns:r="http://schemas.openxmlformats.org/officeDocument/2006/relationships">
+<w:document xmlns:w="http://schemas.openxmlformats.org/wordprocessingml/2006/main" xmlns:r="http://schemas.openxmlformats.org/officeDocument/2006/relationships" xmlns:wp="http://schemas.openxmlformats.org/drawingml/2006/wordprocessingDrawing" xmlns:a="http://schemas.openxmlformats.org/drawingml/2006/main" xmlns:pic="http://schemas.openxmlformats.org/drawingml/2006/picture">
   <w:body>
     <w:p>
       <w:pPr>
@@ -355,6 +355,9 @@
       </w:r>
     </w:p>
     <w:sectPr>
+      <w:footerReference w:type="default" r:id="rId3"/>
+      <w:titlePg/>
+      <w:pgNumType w:start="1"/>
       <w:pgSz w:w="11906" w:h="16838"/>
       <w:pgMar w:top="2098" w:right="1474" w:bottom="1984" w:left="1587" w:header="720" w:footer="720" w:gutter="0"/>
     </w:sectPr>
@@ -362,6 +365,67 @@
 </w:document>
 </file>
 
+<file path=word/footer1.xml><?xml version="1.0" encoding="utf-8"?>
+<w:ftr xmlns:w="http://schemas.openxmlformats.org/wordprocessingml/2006/main">
+  <w:p>
+    <w:pPr>
+      <w:jc w:val="center"/>
+    </w:pPr>
+    <w:r>
+      <w:rPr>
+        <w:rFonts w:ascii="仿宋_GB2312" w:hAnsi="仿宋_GB2312" w:eastAsia="仿宋_GB2312" w:cs="仿宋_GB2312"/>
+        <w:sz w:val="28"/>
+        <w:szCs w:val="28"/>
+      </w:rPr>
+      <w:t>— </w:t>
+    </w:r>
+    <w:r>
+      <w:rPr>
+        <w:rFonts w:ascii="仿宋_GB2312" w:hAnsi="仿宋_GB2312" w:eastAsia="仿宋_GB2312" w:cs="仿宋_GB2312"/>
+        <w:sz w:val="28"/>
+        <w:szCs w:val="28"/>
+      </w:rPr>
+      <w:fldChar w:fldCharType="begin"/>
+    </w:r>
+    <w:r>
+      <w:instrText xml:space="preserve"> PAGE </w:instrText>
+    </w:r>
+    <w:r>
+      <w:rPr>
+        <w:rFonts w:ascii="仿宋_GB2312" w:hAnsi="仿宋_GB2312" w:eastAsia="仿宋_GB2312" w:cs="仿宋_GB2312"/>
+        <w:sz w:val="28"/>
+        <w:szCs w:val="28"/>
+      </w:rPr>
+      <w:fldChar w:fldCharType="separate"/>
+    </w:r>
+    <w:r>
+      <w:rPr>
+        <w:rFonts w:ascii="仿宋_GB2312" w:hAnsi="仿宋_GB2312" w:eastAsia="仿宋_GB2312" w:cs="仿宋_GB2312"/>
+        <w:sz w:val="28"/>
+        <w:szCs w:val="28"/>
+      </w:rPr>
+      <w:t>1</w:t>
+    </w:r>
+    <w:r>
+      <w:rPr>
+        <w:rFonts w:ascii="仿宋_GB2312" w:hAnsi="仿宋_GB2312" w:eastAsia="仿宋_GB2312" w:cs="仿宋_GB2312"/>
+        <w:sz w:val="28"/>
+        <w:szCs w:val="28"/>
+      </w:rPr>
+      <w:fldChar w:fldCharType="end"/>
+    </w:r>
+    <w:r>
+      <w:rPr>
+        <w:rFonts w:ascii="仿宋_GB2312" w:hAnsi="仿宋_GB2312" w:eastAsia="仿宋_GB2312" w:cs="仿宋_GB2312"/>
+        <w:sz w:val="28"/>
+        <w:szCs w:val="28"/>
+      </w:rPr>
+      <w:t> —</w:t>
+    </w:r>
+  </w:p>
+</w:ftr>
+</file>
+
 <file path=word/styles.xml><?xml version="1.0" encoding="utf-8"?>
 <w:styles xmlns:w="http://schemas.openxmlformats.org/wordprocessingml/2006/main">
   <w:docDefaults>

</xml_diff>